<commit_message>
uh dan perjadin spd
</commit_message>
<xml_diff>
--- a/public/spd-format.docx
+++ b/public/spd-format.docx
@@ -246,23 +246,95 @@
                 <w:sz w:val="18"/>
                 <w:szCs w:val="18"/>
               </w:rPr>
-              <w:t xml:space="preserve"> Cimincrang </w:t>
-            </w:r>
+              <w:t xml:space="preserve"> </w:t>
+            </w:r>
+            <w:proofErr w:type="spellStart"/>
             <w:r>
               <w:rPr>
                 <w:rFonts w:ascii="Arial" w:eastAsia="Arial" w:hAnsi="Arial" w:cs="Arial"/>
                 <w:sz w:val="18"/>
                 <w:szCs w:val="18"/>
               </w:rPr>
-              <w:t>No.</w:t>
-            </w:r>
+              <w:t>Cimincrang</w:t>
+            </w:r>
+            <w:proofErr w:type="spellEnd"/>
             <w:r>
               <w:rPr>
                 <w:rFonts w:ascii="Arial" w:eastAsia="Arial" w:hAnsi="Arial" w:cs="Arial"/>
                 <w:sz w:val="18"/>
                 <w:szCs w:val="18"/>
               </w:rPr>
-              <w:t xml:space="preserve"> 26 Kel. Cimincrang Kec. Gedebage Kota Bandung 40294</w:t>
+              <w:t xml:space="preserve"> </w:t>
+            </w:r>
+            <w:r>
+              <w:rPr>
+                <w:rFonts w:ascii="Arial" w:eastAsia="Arial" w:hAnsi="Arial" w:cs="Arial"/>
+                <w:sz w:val="18"/>
+                <w:szCs w:val="18"/>
+              </w:rPr>
+              <w:t>No.</w:t>
+            </w:r>
+            <w:r>
+              <w:rPr>
+                <w:rFonts w:ascii="Arial" w:eastAsia="Arial" w:hAnsi="Arial" w:cs="Arial"/>
+                <w:sz w:val="18"/>
+                <w:szCs w:val="18"/>
+              </w:rPr>
+              <w:t xml:space="preserve"> 26 Kel. </w:t>
+            </w:r>
+            <w:proofErr w:type="spellStart"/>
+            <w:r>
+              <w:rPr>
+                <w:rFonts w:ascii="Arial" w:eastAsia="Arial" w:hAnsi="Arial" w:cs="Arial"/>
+                <w:sz w:val="18"/>
+                <w:szCs w:val="18"/>
+              </w:rPr>
+              <w:t>Cimincrang</w:t>
+            </w:r>
+            <w:proofErr w:type="spellEnd"/>
+            <w:r>
+              <w:rPr>
+                <w:rFonts w:ascii="Arial" w:eastAsia="Arial" w:hAnsi="Arial" w:cs="Arial"/>
+                <w:sz w:val="18"/>
+                <w:szCs w:val="18"/>
+              </w:rPr>
+              <w:t xml:space="preserve"> </w:t>
+            </w:r>
+            <w:proofErr w:type="spellStart"/>
+            <w:r>
+              <w:rPr>
+                <w:rFonts w:ascii="Arial" w:eastAsia="Arial" w:hAnsi="Arial" w:cs="Arial"/>
+                <w:sz w:val="18"/>
+                <w:szCs w:val="18"/>
+              </w:rPr>
+              <w:t>Kec</w:t>
+            </w:r>
+            <w:proofErr w:type="spellEnd"/>
+            <w:r>
+              <w:rPr>
+                <w:rFonts w:ascii="Arial" w:eastAsia="Arial" w:hAnsi="Arial" w:cs="Arial"/>
+                <w:sz w:val="18"/>
+                <w:szCs w:val="18"/>
+              </w:rPr>
+              <w:t xml:space="preserve">. </w:t>
+            </w:r>
+            <w:proofErr w:type="spellStart"/>
+            <w:r>
+              <w:rPr>
+                <w:rFonts w:ascii="Arial" w:eastAsia="Arial" w:hAnsi="Arial" w:cs="Arial"/>
+                <w:sz w:val="18"/>
+                <w:szCs w:val="18"/>
+              </w:rPr>
+              <w:t>Gedebage</w:t>
+            </w:r>
+            <w:proofErr w:type="spellEnd"/>
+            <w:r>
+              <w:rPr>
+                <w:rFonts w:ascii="Arial" w:eastAsia="Arial" w:hAnsi="Arial" w:cs="Arial"/>
+                <w:sz w:val="18"/>
+                <w:szCs w:val="18"/>
+              </w:rPr>
+              <w:t xml:space="preserve"> Kota Bandung 40294</w:t>
             </w:r>
           </w:p>
           <w:p>
@@ -673,6 +745,7 @@
                 <w:lang w:val="id-ID"/>
               </w:rPr>
             </w:pPr>
+            <w:proofErr w:type="spellStart"/>
             <w:r>
               <w:rPr>
                 <w:rFonts w:ascii="Arial" w:hAnsi="Arial" w:cs="Arial"/>
@@ -681,6 +754,7 @@
               </w:rPr>
               <w:t>Pejabat</w:t>
             </w:r>
+            <w:proofErr w:type="spellEnd"/>
             <w:r>
               <w:rPr>
                 <w:rFonts w:ascii="Arial" w:hAnsi="Arial" w:cs="Arial"/>
@@ -738,7 +812,16 @@
                 <w:szCs w:val="20"/>
                 <w:lang w:val="sv-SE"/>
               </w:rPr>
-              <w:t xml:space="preserve">{unit} </w:t>
+              <w:t>{unit</w:t>
+            </w:r>
+            <w:r>
+              <w:rPr>
+                <w:rFonts w:ascii="Arial" w:hAnsi="Arial" w:cs="Arial"/>
+                <w:sz w:val="20"/>
+                <w:szCs w:val="20"/>
+                <w:lang w:val="sv-SE"/>
+              </w:rPr>
+              <w:t xml:space="preserve">} </w:t>
             </w:r>
             <w:r>
               <w:rPr>
@@ -860,6 +943,7 @@
               </w:rPr>
               <w:t xml:space="preserve"> </w:t>
             </w:r>
+            <w:proofErr w:type="spellStart"/>
             <w:r>
               <w:rPr>
                 <w:rFonts w:ascii="Arial" w:hAnsi="Arial" w:cs="Arial"/>
@@ -867,7 +951,17 @@
                 <w:szCs w:val="20"/>
                 <w:lang w:val="es-MX"/>
               </w:rPr>
-              <w:t xml:space="preserve">Pegawai yang </w:t>
+              <w:t>Pegawai</w:t>
+            </w:r>
+            <w:proofErr w:type="spellEnd"/>
+            <w:r>
+              <w:rPr>
+                <w:rFonts w:ascii="Arial" w:hAnsi="Arial" w:cs="Arial"/>
+                <w:sz w:val="20"/>
+                <w:szCs w:val="20"/>
+                <w:lang w:val="es-MX"/>
+              </w:rPr>
+              <w:t xml:space="preserve"> yang </w:t>
             </w:r>
             <w:r>
               <w:rPr>
@@ -1020,6 +1114,7 @@
                 <w:lang w:val="id-ID"/>
               </w:rPr>
             </w:pPr>
+            <w:proofErr w:type="spellStart"/>
             <w:r>
               <w:rPr>
                 <w:rFonts w:ascii="Arial" w:hAnsi="Arial" w:cs="Arial"/>
@@ -1028,6 +1123,7 @@
               </w:rPr>
               <w:t>Pangkat</w:t>
             </w:r>
+            <w:proofErr w:type="spellEnd"/>
             <w:r>
               <w:rPr>
                 <w:rFonts w:ascii="Arial" w:hAnsi="Arial" w:cs="Arial"/>
@@ -1115,7 +1211,25 @@
                 <w:sz w:val="20"/>
                 <w:szCs w:val="20"/>
               </w:rPr>
-              <w:t>{gol}</w:t>
+              <w:t>{</w:t>
+            </w:r>
+            <w:proofErr w:type="spellStart"/>
+            <w:r>
+              <w:rPr>
+                <w:rFonts w:ascii="Arial" w:hAnsi="Arial" w:cs="Arial"/>
+                <w:sz w:val="20"/>
+                <w:szCs w:val="20"/>
+              </w:rPr>
+              <w:t>gol</w:t>
+            </w:r>
+            <w:proofErr w:type="spellEnd"/>
+            <w:r>
+              <w:rPr>
+                <w:rFonts w:ascii="Arial" w:hAnsi="Arial" w:cs="Arial"/>
+                <w:sz w:val="20"/>
+                <w:szCs w:val="20"/>
+              </w:rPr>
+              <w:t>}</w:t>
             </w:r>
           </w:p>
         </w:tc>
@@ -1185,6 +1299,7 @@
                 <w:lang w:val="id-ID"/>
               </w:rPr>
             </w:pPr>
+            <w:proofErr w:type="spellStart"/>
             <w:r>
               <w:rPr>
                 <w:rFonts w:ascii="Arial" w:hAnsi="Arial" w:cs="Arial"/>
@@ -1193,6 +1308,7 @@
               </w:rPr>
               <w:t>Jabatan</w:t>
             </w:r>
+            <w:proofErr w:type="spellEnd"/>
             <w:r>
               <w:rPr>
                 <w:rFonts w:ascii="Arial" w:hAnsi="Arial" w:cs="Arial"/>
@@ -1256,7 +1372,25 @@
                 <w:sz w:val="20"/>
                 <w:szCs w:val="20"/>
               </w:rPr>
-              <w:t>{jabatan}</w:t>
+              <w:t>{</w:t>
+            </w:r>
+            <w:proofErr w:type="spellStart"/>
+            <w:r>
+              <w:rPr>
+                <w:rFonts w:ascii="Arial" w:hAnsi="Arial" w:cs="Arial"/>
+                <w:sz w:val="20"/>
+                <w:szCs w:val="20"/>
+              </w:rPr>
+              <w:t>jabatan</w:t>
+            </w:r>
+            <w:proofErr w:type="spellEnd"/>
+            <w:r>
+              <w:rPr>
+                <w:rFonts w:ascii="Arial" w:hAnsi="Arial" w:cs="Arial"/>
+                <w:sz w:val="20"/>
+                <w:szCs w:val="20"/>
+              </w:rPr>
+              <w:t>}</w:t>
             </w:r>
           </w:p>
         </w:tc>
@@ -1505,6 +1639,7 @@
               </w:rPr>
               <w:t xml:space="preserve"> </w:t>
             </w:r>
+            <w:proofErr w:type="spellStart"/>
             <w:r>
               <w:rPr>
                 <w:rFonts w:ascii="Arial" w:hAnsi="Arial" w:cs="Arial"/>
@@ -1513,6 +1648,7 @@
               </w:rPr>
               <w:t>Perjalanan</w:t>
             </w:r>
+            <w:proofErr w:type="spellEnd"/>
             <w:r>
               <w:rPr>
                 <w:rFonts w:ascii="Arial" w:hAnsi="Arial" w:cs="Arial"/>
@@ -1530,6 +1666,7 @@
               </w:rPr>
               <w:t>D</w:t>
             </w:r>
+            <w:proofErr w:type="spellStart"/>
             <w:r>
               <w:rPr>
                 <w:rFonts w:ascii="Arial" w:hAnsi="Arial" w:cs="Arial"/>
@@ -1538,6 +1675,7 @@
               </w:rPr>
               <w:t>inas</w:t>
             </w:r>
+            <w:proofErr w:type="spellEnd"/>
           </w:p>
         </w:tc>
         <w:tc>
@@ -1642,14 +1780,34 @@
               </w:rPr>
               <w:t xml:space="preserve"> </w:t>
             </w:r>
-            <w:r>
-              <w:rPr>
-                <w:rFonts w:ascii="Arial" w:hAnsi="Arial" w:cs="Arial"/>
-                <w:sz w:val="20"/>
-                <w:szCs w:val="20"/>
-              </w:rPr>
-              <w:t>angkut yang dipergunakan</w:t>
-            </w:r>
+            <w:proofErr w:type="spellStart"/>
+            <w:r>
+              <w:rPr>
+                <w:rFonts w:ascii="Arial" w:hAnsi="Arial" w:cs="Arial"/>
+                <w:sz w:val="20"/>
+                <w:szCs w:val="20"/>
+              </w:rPr>
+              <w:t>angkut</w:t>
+            </w:r>
+            <w:proofErr w:type="spellEnd"/>
+            <w:r>
+              <w:rPr>
+                <w:rFonts w:ascii="Arial" w:hAnsi="Arial" w:cs="Arial"/>
+                <w:sz w:val="20"/>
+                <w:szCs w:val="20"/>
+              </w:rPr>
+              <w:t xml:space="preserve"> yang </w:t>
+            </w:r>
+            <w:proofErr w:type="spellStart"/>
+            <w:r>
+              <w:rPr>
+                <w:rFonts w:ascii="Arial" w:hAnsi="Arial" w:cs="Arial"/>
+                <w:sz w:val="20"/>
+                <w:szCs w:val="20"/>
+              </w:rPr>
+              <w:t>dipergunakan</w:t>
+            </w:r>
+            <w:proofErr w:type="spellEnd"/>
           </w:p>
         </w:tc>
         <w:tc>
@@ -1787,6 +1945,7 @@
                 <w:szCs w:val="20"/>
               </w:rPr>
             </w:pPr>
+            <w:proofErr w:type="spellStart"/>
             <w:r>
               <w:rPr>
                 <w:rFonts w:ascii="Arial" w:hAnsi="Arial" w:cs="Arial"/>
@@ -1795,6 +1954,7 @@
               </w:rPr>
               <w:t>Tempat</w:t>
             </w:r>
+            <w:proofErr w:type="spellEnd"/>
             <w:r>
               <w:rPr>
                 <w:rFonts w:ascii="Arial" w:hAnsi="Arial" w:cs="Arial"/>
@@ -1803,6 +1963,7 @@
               </w:rPr>
               <w:t xml:space="preserve"> </w:t>
             </w:r>
+            <w:proofErr w:type="spellStart"/>
             <w:r>
               <w:rPr>
                 <w:rFonts w:ascii="Arial" w:hAnsi="Arial" w:cs="Arial"/>
@@ -1811,6 +1972,7 @@
               </w:rPr>
               <w:t>berangkat</w:t>
             </w:r>
+            <w:proofErr w:type="spellEnd"/>
           </w:p>
         </w:tc>
         <w:tc>
@@ -1937,6 +2099,7 @@
                 <w:szCs w:val="20"/>
               </w:rPr>
             </w:pPr>
+            <w:proofErr w:type="spellStart"/>
             <w:r>
               <w:rPr>
                 <w:rFonts w:ascii="Arial" w:hAnsi="Arial" w:cs="Arial"/>
@@ -1945,6 +2108,7 @@
               </w:rPr>
               <w:t>Tempat</w:t>
             </w:r>
+            <w:proofErr w:type="spellEnd"/>
             <w:r>
               <w:rPr>
                 <w:rFonts w:ascii="Arial" w:hAnsi="Arial" w:cs="Arial"/>
@@ -1953,6 +2117,7 @@
               </w:rPr>
               <w:t xml:space="preserve"> </w:t>
             </w:r>
+            <w:proofErr w:type="spellStart"/>
             <w:r>
               <w:rPr>
                 <w:rFonts w:ascii="Arial" w:hAnsi="Arial" w:cs="Arial"/>
@@ -1961,6 +2126,7 @@
               </w:rPr>
               <w:t>tujuan</w:t>
             </w:r>
+            <w:proofErr w:type="spellEnd"/>
           </w:p>
         </w:tc>
         <w:tc>
@@ -2110,6 +2276,7 @@
               </w:rPr>
               <w:t xml:space="preserve"> </w:t>
             </w:r>
+            <w:proofErr w:type="spellStart"/>
             <w:r>
               <w:rPr>
                 <w:rFonts w:ascii="Arial" w:hAnsi="Arial" w:cs="Arial"/>
@@ -2118,6 +2285,7 @@
               </w:rPr>
               <w:t>Perjalanan</w:t>
             </w:r>
+            <w:proofErr w:type="spellEnd"/>
             <w:r>
               <w:rPr>
                 <w:rFonts w:ascii="Arial" w:hAnsi="Arial" w:cs="Arial"/>
@@ -2187,8 +2355,18 @@
                 <w:sz w:val="20"/>
                 <w:szCs w:val="20"/>
               </w:rPr>
-              <w:t>{lama} hari</w:t>
-            </w:r>
+              <w:t xml:space="preserve">{lama} </w:t>
+            </w:r>
+            <w:proofErr w:type="spellStart"/>
+            <w:r>
+              <w:rPr>
+                <w:rFonts w:ascii="Arial" w:hAnsi="Arial" w:cs="Arial"/>
+                <w:sz w:val="20"/>
+                <w:szCs w:val="20"/>
+              </w:rPr>
+              <w:t>hari</w:t>
+            </w:r>
+            <w:proofErr w:type="spellEnd"/>
           </w:p>
         </w:tc>
       </w:tr>
@@ -2255,6 +2433,7 @@
                 <w:szCs w:val="20"/>
               </w:rPr>
             </w:pPr>
+            <w:proofErr w:type="spellStart"/>
             <w:r>
               <w:rPr>
                 <w:rFonts w:ascii="Arial" w:hAnsi="Arial" w:cs="Arial"/>
@@ -2263,6 +2442,7 @@
               </w:rPr>
               <w:t>Tanggal</w:t>
             </w:r>
+            <w:proofErr w:type="spellEnd"/>
             <w:r>
               <w:rPr>
                 <w:rFonts w:ascii="Arial" w:hAnsi="Arial" w:cs="Arial"/>
@@ -2271,6 +2451,7 @@
               </w:rPr>
               <w:t xml:space="preserve"> </w:t>
             </w:r>
+            <w:proofErr w:type="spellStart"/>
             <w:r>
               <w:rPr>
                 <w:rFonts w:ascii="Arial" w:hAnsi="Arial" w:cs="Arial"/>
@@ -2279,6 +2460,7 @@
               </w:rPr>
               <w:t>Berangkat</w:t>
             </w:r>
+            <w:proofErr w:type="spellEnd"/>
           </w:p>
         </w:tc>
         <w:tc>
@@ -2332,7 +2514,25 @@
                 <w:sz w:val="20"/>
                 <w:szCs w:val="20"/>
               </w:rPr>
-              <w:t>{tglBerangkat}</w:t>
+              <w:t>{</w:t>
+            </w:r>
+            <w:proofErr w:type="spellStart"/>
+            <w:r>
+              <w:rPr>
+                <w:rFonts w:ascii="Arial" w:hAnsi="Arial" w:cs="Arial"/>
+                <w:sz w:val="20"/>
+                <w:szCs w:val="20"/>
+              </w:rPr>
+              <w:t>tglBerangkat</w:t>
+            </w:r>
+            <w:proofErr w:type="spellEnd"/>
+            <w:r>
+              <w:rPr>
+                <w:rFonts w:ascii="Arial" w:hAnsi="Arial" w:cs="Arial"/>
+                <w:sz w:val="20"/>
+                <w:szCs w:val="20"/>
+              </w:rPr>
+              <w:t>}</w:t>
             </w:r>
           </w:p>
         </w:tc>
@@ -2406,6 +2606,7 @@
                 <w:lang w:val="id-ID"/>
               </w:rPr>
             </w:pPr>
+            <w:proofErr w:type="spellStart"/>
             <w:r>
               <w:rPr>
                 <w:rFonts w:ascii="Arial" w:hAnsi="Arial" w:cs="Arial"/>
@@ -2414,6 +2615,7 @@
               </w:rPr>
               <w:t>Tanggal</w:t>
             </w:r>
+            <w:proofErr w:type="spellEnd"/>
             <w:r>
               <w:rPr>
                 <w:rFonts w:ascii="Arial" w:hAnsi="Arial" w:cs="Arial"/>
@@ -2422,6 +2624,7 @@
               </w:rPr>
               <w:t xml:space="preserve"> </w:t>
             </w:r>
+            <w:proofErr w:type="spellStart"/>
             <w:r>
               <w:rPr>
                 <w:rFonts w:ascii="Arial" w:hAnsi="Arial" w:cs="Arial"/>
@@ -2430,6 +2633,7 @@
               </w:rPr>
               <w:t>harus</w:t>
             </w:r>
+            <w:proofErr w:type="spellEnd"/>
             <w:r>
               <w:rPr>
                 <w:rFonts w:ascii="Arial" w:hAnsi="Arial" w:cs="Arial"/>
@@ -2438,6 +2642,7 @@
               </w:rPr>
               <w:t xml:space="preserve"> </w:t>
             </w:r>
+            <w:proofErr w:type="spellStart"/>
             <w:r>
               <w:rPr>
                 <w:rFonts w:ascii="Arial" w:hAnsi="Arial" w:cs="Arial"/>
@@ -2446,6 +2651,7 @@
               </w:rPr>
               <w:t>kembali</w:t>
             </w:r>
+            <w:proofErr w:type="spellEnd"/>
             <w:r>
               <w:rPr>
                 <w:rFonts w:ascii="Arial" w:hAnsi="Arial" w:cs="Arial"/>
@@ -2510,7 +2716,25 @@
                 <w:sz w:val="20"/>
                 <w:szCs w:val="20"/>
               </w:rPr>
-              <w:t>{tglKembali}</w:t>
+              <w:t>{</w:t>
+            </w:r>
+            <w:proofErr w:type="spellStart"/>
+            <w:r>
+              <w:rPr>
+                <w:rFonts w:ascii="Arial" w:hAnsi="Arial" w:cs="Arial"/>
+                <w:sz w:val="20"/>
+                <w:szCs w:val="20"/>
+              </w:rPr>
+              <w:t>tglKembali</w:t>
+            </w:r>
+            <w:proofErr w:type="spellEnd"/>
+            <w:r>
+              <w:rPr>
+                <w:rFonts w:ascii="Arial" w:hAnsi="Arial" w:cs="Arial"/>
+                <w:sz w:val="20"/>
+                <w:szCs w:val="20"/>
+              </w:rPr>
+              <w:t>}</w:t>
             </w:r>
           </w:p>
         </w:tc>
@@ -3274,6 +3498,7 @@
                 <w:szCs w:val="20"/>
               </w:rPr>
             </w:pPr>
+            <w:proofErr w:type="spellStart"/>
             <w:r>
               <w:rPr>
                 <w:rFonts w:ascii="Arial" w:hAnsi="Arial" w:cs="Arial"/>
@@ -3282,6 +3507,7 @@
               </w:rPr>
               <w:t>Pembebanan</w:t>
             </w:r>
+            <w:proofErr w:type="spellEnd"/>
             <w:r>
               <w:rPr>
                 <w:rFonts w:ascii="Arial" w:hAnsi="Arial" w:cs="Arial"/>
@@ -3290,6 +3516,7 @@
               </w:rPr>
               <w:t xml:space="preserve"> </w:t>
             </w:r>
+            <w:proofErr w:type="spellStart"/>
             <w:r>
               <w:rPr>
                 <w:rFonts w:ascii="Arial" w:hAnsi="Arial" w:cs="Arial"/>
@@ -3298,6 +3525,7 @@
               </w:rPr>
               <w:t>Anggaran</w:t>
             </w:r>
+            <w:proofErr w:type="spellEnd"/>
           </w:p>
         </w:tc>
         <w:tc>
@@ -3386,6 +3614,7 @@
                 <w:szCs w:val="20"/>
               </w:rPr>
             </w:pPr>
+            <w:proofErr w:type="spellStart"/>
             <w:r>
               <w:rPr>
                 <w:rFonts w:ascii="Arial" w:hAnsi="Arial" w:cs="Arial"/>
@@ -3394,6 +3623,7 @@
               </w:rPr>
               <w:t>Instansi</w:t>
             </w:r>
+            <w:proofErr w:type="spellEnd"/>
           </w:p>
         </w:tc>
         <w:tc>
@@ -3645,13 +3875,23 @@
                 <w:szCs w:val="20"/>
               </w:rPr>
             </w:pPr>
-            <w:r>
-              <w:rPr>
-                <w:rFonts w:ascii="Arial" w:hAnsi="Arial" w:cs="Arial"/>
-                <w:sz w:val="20"/>
-                <w:szCs w:val="20"/>
-              </w:rPr>
-              <w:t>Keterangan lain-lain</w:t>
+            <w:proofErr w:type="spellStart"/>
+            <w:r>
+              <w:rPr>
+                <w:rFonts w:ascii="Arial" w:hAnsi="Arial" w:cs="Arial"/>
+                <w:sz w:val="20"/>
+                <w:szCs w:val="20"/>
+              </w:rPr>
+              <w:t>Keterangan</w:t>
+            </w:r>
+            <w:proofErr w:type="spellEnd"/>
+            <w:r>
+              <w:rPr>
+                <w:rFonts w:ascii="Arial" w:hAnsi="Arial" w:cs="Arial"/>
+                <w:sz w:val="20"/>
+                <w:szCs w:val="20"/>
+              </w:rPr>
+              <w:t xml:space="preserve"> lain-lain</w:t>
             </w:r>
           </w:p>
         </w:tc>
@@ -3782,7 +4022,22 @@
           <w:sz w:val="20"/>
         </w:rPr>
         <w:tab/>
-        <w:t>Dikeluarkan di</w:t>
+      </w:r>
+      <w:proofErr w:type="spellStart"/>
+      <w:r>
+        <w:rPr>
+          <w:rFonts w:ascii="Arial" w:hAnsi="Arial" w:cs="Arial"/>
+          <w:sz w:val="20"/>
+        </w:rPr>
+        <w:t>Dikeluarkan</w:t>
+      </w:r>
+      <w:proofErr w:type="spellEnd"/>
+      <w:r>
+        <w:rPr>
+          <w:rFonts w:ascii="Arial" w:hAnsi="Arial" w:cs="Arial"/>
+          <w:sz w:val="20"/>
+        </w:rPr>
+        <w:t xml:space="preserve"> di</w:t>
       </w:r>
       <w:r>
         <w:rPr>
@@ -3816,8 +4071,17 @@
           <w:sz w:val="20"/>
         </w:rPr>
         <w:tab/>
-        <w:t>Pada tanggal</w:t>
+        <w:t xml:space="preserve">Pada </w:t>
       </w:r>
+      <w:proofErr w:type="spellStart"/>
+      <w:r>
+        <w:rPr>
+          <w:rFonts w:ascii="Arial" w:hAnsi="Arial" w:cs="Arial"/>
+          <w:sz w:val="20"/>
+        </w:rPr>
+        <w:t>tanggal</w:t>
+      </w:r>
+      <w:proofErr w:type="spellEnd"/>
       <w:r>
         <w:rPr>
           <w:rFonts w:ascii="Arial" w:hAnsi="Arial" w:cs="Arial"/>
@@ -3838,7 +4102,23 @@
           <w:rFonts w:ascii="Arial" w:hAnsi="Arial" w:cs="Arial"/>
           <w:sz w:val="20"/>
         </w:rPr>
-        <w:t>{tglBerangkat}</w:t>
+        <w:t>{</w:t>
+      </w:r>
+      <w:proofErr w:type="spellStart"/>
+      <w:r>
+        <w:rPr>
+          <w:rFonts w:ascii="Arial" w:hAnsi="Arial" w:cs="Arial"/>
+          <w:sz w:val="20"/>
+        </w:rPr>
+        <w:t>tglBerangkat</w:t>
+      </w:r>
+      <w:proofErr w:type="spellEnd"/>
+      <w:r>
+        <w:rPr>
+          <w:rFonts w:ascii="Arial" w:hAnsi="Arial" w:cs="Arial"/>
+          <w:sz w:val="20"/>
+        </w:rPr>
+        <w:t>}</w:t>
       </w:r>
       <w:r>
         <w:rPr>
@@ -4240,6 +4520,7 @@
                 <w:sz w:val="20"/>
               </w:rPr>
             </w:pPr>
+            <w:proofErr w:type="spellStart"/>
             <w:r>
               <w:rPr>
                 <w:rFonts w:ascii="Arial" w:hAnsi="Arial" w:cs="Arial"/>
@@ -4247,6 +4528,7 @@
               </w:rPr>
               <w:t>Berangkat</w:t>
             </w:r>
+            <w:proofErr w:type="spellEnd"/>
             <w:r>
               <w:rPr>
                 <w:rFonts w:ascii="Arial" w:hAnsi="Arial" w:cs="Arial"/>
@@ -4254,6 +4536,7 @@
               </w:rPr>
               <w:t xml:space="preserve"> </w:t>
             </w:r>
+            <w:proofErr w:type="spellStart"/>
             <w:r>
               <w:rPr>
                 <w:rFonts w:ascii="Arial" w:hAnsi="Arial" w:cs="Arial"/>
@@ -4261,6 +4544,7 @@
               </w:rPr>
               <w:t>dari</w:t>
             </w:r>
+            <w:proofErr w:type="spellEnd"/>
           </w:p>
         </w:tc>
         <w:tc>
@@ -4339,8 +4623,17 @@
                 <w:rFonts w:ascii="Arial" w:hAnsi="Arial" w:cs="Arial"/>
                 <w:sz w:val="20"/>
               </w:rPr>
-              <w:t>(Tempat</w:t>
-            </w:r>
+              <w:t>(</w:t>
+            </w:r>
+            <w:proofErr w:type="spellStart"/>
+            <w:r>
+              <w:rPr>
+                <w:rFonts w:ascii="Arial" w:hAnsi="Arial" w:cs="Arial"/>
+                <w:sz w:val="20"/>
+              </w:rPr>
+              <w:t>Tempat</w:t>
+            </w:r>
+            <w:proofErr w:type="spellEnd"/>
             <w:r>
               <w:rPr>
                 <w:rFonts w:ascii="Arial" w:hAnsi="Arial" w:cs="Arial"/>
@@ -4348,12 +4641,21 @@
               </w:rPr>
               <w:t xml:space="preserve"> </w:t>
             </w:r>
-            <w:r>
-              <w:rPr>
-                <w:rFonts w:ascii="Arial" w:hAnsi="Arial" w:cs="Arial"/>
-                <w:sz w:val="20"/>
-              </w:rPr>
-              <w:t>kedudukan)</w:t>
+            <w:proofErr w:type="spellStart"/>
+            <w:r>
+              <w:rPr>
+                <w:rFonts w:ascii="Arial" w:hAnsi="Arial" w:cs="Arial"/>
+                <w:sz w:val="20"/>
+              </w:rPr>
+              <w:t>kedudukan</w:t>
+            </w:r>
+            <w:proofErr w:type="spellEnd"/>
+            <w:r>
+              <w:rPr>
+                <w:rFonts w:ascii="Arial" w:hAnsi="Arial" w:cs="Arial"/>
+                <w:sz w:val="20"/>
+              </w:rPr>
+              <w:t>)</w:t>
             </w:r>
           </w:p>
         </w:tc>
@@ -4562,6 +4864,7 @@
               </w:rPr>
               <w:t xml:space="preserve"> </w:t>
             </w:r>
+            <w:proofErr w:type="spellStart"/>
             <w:r>
               <w:rPr>
                 <w:rFonts w:ascii="Arial" w:hAnsi="Arial" w:cs="Arial"/>
@@ -4569,6 +4872,7 @@
               </w:rPr>
               <w:t>tanggal</w:t>
             </w:r>
+            <w:proofErr w:type="spellEnd"/>
           </w:p>
         </w:tc>
         <w:tc>
@@ -4693,7 +4997,23 @@
                 <w:rFonts w:ascii="Arial" w:hAnsi="Arial" w:cs="Arial"/>
                 <w:sz w:val="20"/>
               </w:rPr>
-              <w:t>{pejabatMengetahui}</w:t>
+              <w:t>{</w:t>
+            </w:r>
+            <w:proofErr w:type="spellStart"/>
+            <w:r>
+              <w:rPr>
+                <w:rFonts w:ascii="Arial" w:hAnsi="Arial" w:cs="Arial"/>
+                <w:sz w:val="20"/>
+              </w:rPr>
+              <w:t>pejabatMengetahui</w:t>
+            </w:r>
+            <w:proofErr w:type="spellEnd"/>
+            <w:r>
+              <w:rPr>
+                <w:rFonts w:ascii="Arial" w:hAnsi="Arial" w:cs="Arial"/>
+                <w:sz w:val="20"/>
+              </w:rPr>
+              <w:t>}</w:t>
             </w:r>
           </w:p>
         </w:tc>
@@ -4761,7 +5081,23 @@
                 <w:rFonts w:ascii="Arial" w:hAnsi="Arial" w:cs="Arial"/>
                 <w:sz w:val="20"/>
               </w:rPr>
-              <w:t>{jabatanPPT}</w:t>
+              <w:t>{</w:t>
+            </w:r>
+            <w:proofErr w:type="spellStart"/>
+            <w:r>
+              <w:rPr>
+                <w:rFonts w:ascii="Arial" w:hAnsi="Arial" w:cs="Arial"/>
+                <w:sz w:val="20"/>
+              </w:rPr>
+              <w:t>jabatanPPT</w:t>
+            </w:r>
+            <w:proofErr w:type="spellEnd"/>
+            <w:r>
+              <w:rPr>
+                <w:rFonts w:ascii="Arial" w:hAnsi="Arial" w:cs="Arial"/>
+                <w:sz w:val="20"/>
+              </w:rPr>
+              <w:t>}</w:t>
             </w:r>
           </w:p>
         </w:tc>
@@ -5093,7 +5429,16 @@
                 <w:sz w:val="20"/>
                 <w:szCs w:val="20"/>
               </w:rPr>
-              <w:t>{nipPP</w:t>
+              <w:t>{</w:t>
+            </w:r>
+            <w:proofErr w:type="spellStart"/>
+            <w:r>
+              <w:rPr>
+                <w:rFonts w:ascii="Arial" w:hAnsi="Arial" w:cs="Arial"/>
+                <w:sz w:val="20"/>
+                <w:szCs w:val="20"/>
+              </w:rPr>
+              <w:t>nipPP</w:t>
             </w:r>
             <w:r>
               <w:rPr>
@@ -5103,6 +5448,7 @@
               </w:rPr>
               <w:t>T</w:t>
             </w:r>
+            <w:proofErr w:type="spellEnd"/>
             <w:r>
               <w:rPr>
                 <w:rFonts w:ascii="Arial" w:hAnsi="Arial" w:cs="Arial"/>
@@ -5330,6 +5676,7 @@
                 <w:sz w:val="20"/>
               </w:rPr>
             </w:pPr>
+            <w:proofErr w:type="spellStart"/>
             <w:r>
               <w:rPr>
                 <w:rFonts w:ascii="Arial" w:hAnsi="Arial" w:cs="Arial"/>
@@ -5337,6 +5684,7 @@
               </w:rPr>
               <w:t>Berangkat</w:t>
             </w:r>
+            <w:proofErr w:type="spellEnd"/>
             <w:r>
               <w:rPr>
                 <w:rFonts w:ascii="Arial" w:hAnsi="Arial" w:cs="Arial"/>
@@ -5344,6 +5692,7 @@
               </w:rPr>
               <w:t xml:space="preserve"> </w:t>
             </w:r>
+            <w:proofErr w:type="spellStart"/>
             <w:r>
               <w:rPr>
                 <w:rFonts w:ascii="Arial" w:hAnsi="Arial" w:cs="Arial"/>
@@ -5351,6 +5700,7 @@
               </w:rPr>
               <w:t>dari</w:t>
             </w:r>
+            <w:proofErr w:type="spellEnd"/>
           </w:p>
         </w:tc>
         <w:tc>
@@ -5466,6 +5816,7 @@
               </w:rPr>
               <w:t xml:space="preserve"> </w:t>
             </w:r>
+            <w:proofErr w:type="spellStart"/>
             <w:r>
               <w:rPr>
                 <w:rFonts w:ascii="Arial" w:hAnsi="Arial" w:cs="Arial"/>
@@ -5473,6 +5824,7 @@
               </w:rPr>
               <w:t>tanggal</w:t>
             </w:r>
+            <w:proofErr w:type="spellEnd"/>
           </w:p>
         </w:tc>
         <w:tc>
@@ -5601,6 +5953,7 @@
                 <w:sz w:val="20"/>
               </w:rPr>
             </w:pPr>
+            <w:proofErr w:type="spellStart"/>
             <w:r>
               <w:rPr>
                 <w:rFonts w:ascii="Arial" w:hAnsi="Arial" w:cs="Arial"/>
@@ -5608,6 +5961,7 @@
               </w:rPr>
               <w:t>Kepala</w:t>
             </w:r>
+            <w:proofErr w:type="spellEnd"/>
           </w:p>
         </w:tc>
         <w:tc>
@@ -5689,8 +6043,17 @@
                 <w:rFonts w:ascii="Arial" w:hAnsi="Arial" w:cs="Arial"/>
                 <w:sz w:val="20"/>
               </w:rPr>
-              <w:t>Pada tanggal</w:t>
-            </w:r>
+              <w:t xml:space="preserve">Pada </w:t>
+            </w:r>
+            <w:proofErr w:type="spellStart"/>
+            <w:r>
+              <w:rPr>
+                <w:rFonts w:ascii="Arial" w:hAnsi="Arial" w:cs="Arial"/>
+                <w:sz w:val="20"/>
+              </w:rPr>
+              <w:t>tanggal</w:t>
+            </w:r>
+            <w:proofErr w:type="spellEnd"/>
           </w:p>
         </w:tc>
         <w:tc>
@@ -5791,6 +6154,7 @@
                 <w:sz w:val="20"/>
               </w:rPr>
             </w:pPr>
+            <w:proofErr w:type="spellStart"/>
             <w:r>
               <w:rPr>
                 <w:rFonts w:ascii="Arial" w:hAnsi="Arial" w:cs="Arial"/>
@@ -5798,6 +6162,7 @@
               </w:rPr>
               <w:t>Kepala</w:t>
             </w:r>
+            <w:proofErr w:type="spellEnd"/>
           </w:p>
         </w:tc>
         <w:tc>
@@ -6434,13 +6799,31 @@
                 <w:sz w:val="20"/>
               </w:rPr>
             </w:pPr>
-            <w:r>
-              <w:rPr>
-                <w:rFonts w:ascii="Arial" w:hAnsi="Arial" w:cs="Arial"/>
-                <w:sz w:val="20"/>
-              </w:rPr>
-              <w:t>Berangkat dari</w:t>
-            </w:r>
+            <w:proofErr w:type="spellStart"/>
+            <w:r>
+              <w:rPr>
+                <w:rFonts w:ascii="Arial" w:hAnsi="Arial" w:cs="Arial"/>
+                <w:sz w:val="20"/>
+              </w:rPr>
+              <w:t>Berangkat</w:t>
+            </w:r>
+            <w:proofErr w:type="spellEnd"/>
+            <w:r>
+              <w:rPr>
+                <w:rFonts w:ascii="Arial" w:hAnsi="Arial" w:cs="Arial"/>
+                <w:sz w:val="20"/>
+              </w:rPr>
+              <w:t xml:space="preserve"> </w:t>
+            </w:r>
+            <w:proofErr w:type="spellStart"/>
+            <w:r>
+              <w:rPr>
+                <w:rFonts w:ascii="Arial" w:hAnsi="Arial" w:cs="Arial"/>
+                <w:sz w:val="20"/>
+              </w:rPr>
+              <w:t>dari</w:t>
+            </w:r>
+            <w:proofErr w:type="spellEnd"/>
           </w:p>
         </w:tc>
         <w:tc>
@@ -6511,8 +6894,17 @@
                 <w:rFonts w:ascii="Arial" w:hAnsi="Arial" w:cs="Arial"/>
                 <w:sz w:val="20"/>
               </w:rPr>
-              <w:t>Pada tanggal</w:t>
-            </w:r>
+              <w:t xml:space="preserve">Pada </w:t>
+            </w:r>
+            <w:proofErr w:type="spellStart"/>
+            <w:r>
+              <w:rPr>
+                <w:rFonts w:ascii="Arial" w:hAnsi="Arial" w:cs="Arial"/>
+                <w:sz w:val="20"/>
+              </w:rPr>
+              <w:t>tanggal</w:t>
+            </w:r>
+            <w:proofErr w:type="spellEnd"/>
           </w:p>
         </w:tc>
         <w:tc>
@@ -6628,6 +7020,7 @@
                 <w:sz w:val="20"/>
               </w:rPr>
             </w:pPr>
+            <w:proofErr w:type="spellStart"/>
             <w:r>
               <w:rPr>
                 <w:rFonts w:ascii="Arial" w:hAnsi="Arial" w:cs="Arial"/>
@@ -6635,6 +7028,7 @@
               </w:rPr>
               <w:t>Kepala</w:t>
             </w:r>
+            <w:proofErr w:type="spellEnd"/>
           </w:p>
         </w:tc>
         <w:tc>
@@ -6686,8 +7080,17 @@
                 <w:rFonts w:ascii="Arial" w:hAnsi="Arial" w:cs="Arial"/>
                 <w:sz w:val="20"/>
               </w:rPr>
-              <w:t>Pada tanggal</w:t>
-            </w:r>
+              <w:t xml:space="preserve">Pada </w:t>
+            </w:r>
+            <w:proofErr w:type="spellStart"/>
+            <w:r>
+              <w:rPr>
+                <w:rFonts w:ascii="Arial" w:hAnsi="Arial" w:cs="Arial"/>
+                <w:sz w:val="20"/>
+              </w:rPr>
+              <w:t>tanggal</w:t>
+            </w:r>
+            <w:proofErr w:type="spellEnd"/>
           </w:p>
         </w:tc>
         <w:tc>
@@ -6789,6 +7192,7 @@
                 <w:sz w:val="20"/>
               </w:rPr>
             </w:pPr>
+            <w:proofErr w:type="spellStart"/>
             <w:r>
               <w:rPr>
                 <w:rFonts w:ascii="Arial" w:hAnsi="Arial" w:cs="Arial"/>
@@ -6796,6 +7200,7 @@
               </w:rPr>
               <w:t>Kepala</w:t>
             </w:r>
+            <w:proofErr w:type="spellEnd"/>
           </w:p>
         </w:tc>
         <w:tc>
@@ -7278,13 +7683,31 @@
                 <w:sz w:val="20"/>
               </w:rPr>
             </w:pPr>
-            <w:r>
-              <w:rPr>
-                <w:rFonts w:ascii="Arial" w:hAnsi="Arial" w:cs="Arial"/>
-                <w:sz w:val="20"/>
-              </w:rPr>
-              <w:t>Berangkat dari</w:t>
-            </w:r>
+            <w:proofErr w:type="spellStart"/>
+            <w:r>
+              <w:rPr>
+                <w:rFonts w:ascii="Arial" w:hAnsi="Arial" w:cs="Arial"/>
+                <w:sz w:val="20"/>
+              </w:rPr>
+              <w:t>Berangkat</w:t>
+            </w:r>
+            <w:proofErr w:type="spellEnd"/>
+            <w:r>
+              <w:rPr>
+                <w:rFonts w:ascii="Arial" w:hAnsi="Arial" w:cs="Arial"/>
+                <w:sz w:val="20"/>
+              </w:rPr>
+              <w:t xml:space="preserve"> </w:t>
+            </w:r>
+            <w:proofErr w:type="spellStart"/>
+            <w:r>
+              <w:rPr>
+                <w:rFonts w:ascii="Arial" w:hAnsi="Arial" w:cs="Arial"/>
+                <w:sz w:val="20"/>
+              </w:rPr>
+              <w:t>dari</w:t>
+            </w:r>
+            <w:proofErr w:type="spellEnd"/>
           </w:p>
         </w:tc>
         <w:tc>
@@ -7354,8 +7777,17 @@
                 <w:rFonts w:ascii="Arial" w:hAnsi="Arial" w:cs="Arial"/>
                 <w:sz w:val="20"/>
               </w:rPr>
-              <w:t>Pada tanggal</w:t>
-            </w:r>
+              <w:t xml:space="preserve">Pada </w:t>
+            </w:r>
+            <w:proofErr w:type="spellStart"/>
+            <w:r>
+              <w:rPr>
+                <w:rFonts w:ascii="Arial" w:hAnsi="Arial" w:cs="Arial"/>
+                <w:sz w:val="20"/>
+              </w:rPr>
+              <w:t>tanggal</w:t>
+            </w:r>
+            <w:proofErr w:type="spellEnd"/>
           </w:p>
         </w:tc>
         <w:tc>
@@ -7471,6 +7903,7 @@
                 <w:sz w:val="20"/>
               </w:rPr>
             </w:pPr>
+            <w:proofErr w:type="spellStart"/>
             <w:r>
               <w:rPr>
                 <w:rFonts w:ascii="Arial" w:hAnsi="Arial" w:cs="Arial"/>
@@ -7478,6 +7911,7 @@
               </w:rPr>
               <w:t>Kepala</w:t>
             </w:r>
+            <w:proofErr w:type="spellEnd"/>
           </w:p>
         </w:tc>
         <w:tc>
@@ -7527,8 +7961,17 @@
                 <w:rFonts w:ascii="Arial" w:hAnsi="Arial" w:cs="Arial"/>
                 <w:sz w:val="20"/>
               </w:rPr>
-              <w:t>Pada tanggal</w:t>
-            </w:r>
+              <w:t xml:space="preserve">Pada </w:t>
+            </w:r>
+            <w:proofErr w:type="spellStart"/>
+            <w:r>
+              <w:rPr>
+                <w:rFonts w:ascii="Arial" w:hAnsi="Arial" w:cs="Arial"/>
+                <w:sz w:val="20"/>
+              </w:rPr>
+              <w:t>tanggal</w:t>
+            </w:r>
+            <w:proofErr w:type="spellEnd"/>
           </w:p>
         </w:tc>
         <w:tc>
@@ -7630,6 +8073,7 @@
                 <w:sz w:val="20"/>
               </w:rPr>
             </w:pPr>
+            <w:proofErr w:type="spellStart"/>
             <w:r>
               <w:rPr>
                 <w:rFonts w:ascii="Arial" w:hAnsi="Arial" w:cs="Arial"/>
@@ -7637,6 +8081,7 @@
               </w:rPr>
               <w:t>Kepala</w:t>
             </w:r>
+            <w:proofErr w:type="spellEnd"/>
           </w:p>
         </w:tc>
         <w:tc>
@@ -7968,7 +8413,23 @@
                 <w:rFonts w:ascii="Arial" w:hAnsi="Arial" w:cs="Arial"/>
                 <w:sz w:val="20"/>
               </w:rPr>
-              <w:t>Telah tiba di</w:t>
+              <w:t xml:space="preserve">Telah </w:t>
+            </w:r>
+            <w:proofErr w:type="spellStart"/>
+            <w:r>
+              <w:rPr>
+                <w:rFonts w:ascii="Arial" w:hAnsi="Arial" w:cs="Arial"/>
+                <w:sz w:val="20"/>
+              </w:rPr>
+              <w:t>tiba</w:t>
+            </w:r>
+            <w:proofErr w:type="spellEnd"/>
+            <w:r>
+              <w:rPr>
+                <w:rFonts w:ascii="Arial" w:hAnsi="Arial" w:cs="Arial"/>
+                <w:sz w:val="20"/>
+              </w:rPr>
+              <w:t xml:space="preserve"> di</w:t>
             </w:r>
           </w:p>
         </w:tc>
@@ -8031,7 +8492,295 @@
                 <w:rFonts w:ascii="Arial" w:hAnsi="Arial" w:cs="Arial"/>
                 <w:sz w:val="20"/>
               </w:rPr>
-              <w:t>Telah diperiksa dengan keterangan bahwa perjalanan tersebut benar dilakukan atas perintahnya, dan semata mata untuk kepentingan jabatan dalam waktu yang sesingkat-singkatnya.</w:t>
+              <w:t xml:space="preserve">Telah </w:t>
+            </w:r>
+            <w:proofErr w:type="spellStart"/>
+            <w:r>
+              <w:rPr>
+                <w:rFonts w:ascii="Arial" w:hAnsi="Arial" w:cs="Arial"/>
+                <w:sz w:val="20"/>
+              </w:rPr>
+              <w:t>diperiksa</w:t>
+            </w:r>
+            <w:proofErr w:type="spellEnd"/>
+            <w:r>
+              <w:rPr>
+                <w:rFonts w:ascii="Arial" w:hAnsi="Arial" w:cs="Arial"/>
+                <w:sz w:val="20"/>
+              </w:rPr>
+              <w:t xml:space="preserve"> </w:t>
+            </w:r>
+            <w:proofErr w:type="spellStart"/>
+            <w:r>
+              <w:rPr>
+                <w:rFonts w:ascii="Arial" w:hAnsi="Arial" w:cs="Arial"/>
+                <w:sz w:val="20"/>
+              </w:rPr>
+              <w:t>dengan</w:t>
+            </w:r>
+            <w:proofErr w:type="spellEnd"/>
+            <w:r>
+              <w:rPr>
+                <w:rFonts w:ascii="Arial" w:hAnsi="Arial" w:cs="Arial"/>
+                <w:sz w:val="20"/>
+              </w:rPr>
+              <w:t xml:space="preserve"> </w:t>
+            </w:r>
+            <w:proofErr w:type="spellStart"/>
+            <w:r>
+              <w:rPr>
+                <w:rFonts w:ascii="Arial" w:hAnsi="Arial" w:cs="Arial"/>
+                <w:sz w:val="20"/>
+              </w:rPr>
+              <w:t>keterangan</w:t>
+            </w:r>
+            <w:proofErr w:type="spellEnd"/>
+            <w:r>
+              <w:rPr>
+                <w:rFonts w:ascii="Arial" w:hAnsi="Arial" w:cs="Arial"/>
+                <w:sz w:val="20"/>
+              </w:rPr>
+              <w:t xml:space="preserve"> </w:t>
+            </w:r>
+            <w:proofErr w:type="spellStart"/>
+            <w:r>
+              <w:rPr>
+                <w:rFonts w:ascii="Arial" w:hAnsi="Arial" w:cs="Arial"/>
+                <w:sz w:val="20"/>
+              </w:rPr>
+              <w:t>bahwa</w:t>
+            </w:r>
+            <w:proofErr w:type="spellEnd"/>
+            <w:r>
+              <w:rPr>
+                <w:rFonts w:ascii="Arial" w:hAnsi="Arial" w:cs="Arial"/>
+                <w:sz w:val="20"/>
+              </w:rPr>
+              <w:t xml:space="preserve"> </w:t>
+            </w:r>
+            <w:proofErr w:type="spellStart"/>
+            <w:r>
+              <w:rPr>
+                <w:rFonts w:ascii="Arial" w:hAnsi="Arial" w:cs="Arial"/>
+                <w:sz w:val="20"/>
+              </w:rPr>
+              <w:t>perjalanan</w:t>
+            </w:r>
+            <w:proofErr w:type="spellEnd"/>
+            <w:r>
+              <w:rPr>
+                <w:rFonts w:ascii="Arial" w:hAnsi="Arial" w:cs="Arial"/>
+                <w:sz w:val="20"/>
+              </w:rPr>
+              <w:t xml:space="preserve"> </w:t>
+            </w:r>
+            <w:proofErr w:type="spellStart"/>
+            <w:r>
+              <w:rPr>
+                <w:rFonts w:ascii="Arial" w:hAnsi="Arial" w:cs="Arial"/>
+                <w:sz w:val="20"/>
+              </w:rPr>
+              <w:t>tersebut</w:t>
+            </w:r>
+            <w:proofErr w:type="spellEnd"/>
+            <w:r>
+              <w:rPr>
+                <w:rFonts w:ascii="Arial" w:hAnsi="Arial" w:cs="Arial"/>
+                <w:sz w:val="20"/>
+              </w:rPr>
+              <w:t xml:space="preserve"> </w:t>
+            </w:r>
+            <w:proofErr w:type="spellStart"/>
+            <w:r>
+              <w:rPr>
+                <w:rFonts w:ascii="Arial" w:hAnsi="Arial" w:cs="Arial"/>
+                <w:sz w:val="20"/>
+              </w:rPr>
+              <w:t>benar</w:t>
+            </w:r>
+            <w:proofErr w:type="spellEnd"/>
+            <w:r>
+              <w:rPr>
+                <w:rFonts w:ascii="Arial" w:hAnsi="Arial" w:cs="Arial"/>
+                <w:sz w:val="20"/>
+              </w:rPr>
+              <w:t xml:space="preserve"> </w:t>
+            </w:r>
+            <w:proofErr w:type="spellStart"/>
+            <w:r>
+              <w:rPr>
+                <w:rFonts w:ascii="Arial" w:hAnsi="Arial" w:cs="Arial"/>
+                <w:sz w:val="20"/>
+              </w:rPr>
+              <w:t>dilakukan</w:t>
+            </w:r>
+            <w:proofErr w:type="spellEnd"/>
+            <w:r>
+              <w:rPr>
+                <w:rFonts w:ascii="Arial" w:hAnsi="Arial" w:cs="Arial"/>
+                <w:sz w:val="20"/>
+              </w:rPr>
+              <w:t xml:space="preserve"> </w:t>
+            </w:r>
+            <w:proofErr w:type="spellStart"/>
+            <w:r>
+              <w:rPr>
+                <w:rFonts w:ascii="Arial" w:hAnsi="Arial" w:cs="Arial"/>
+                <w:sz w:val="20"/>
+              </w:rPr>
+              <w:t>atas</w:t>
+            </w:r>
+            <w:proofErr w:type="spellEnd"/>
+            <w:r>
+              <w:rPr>
+                <w:rFonts w:ascii="Arial" w:hAnsi="Arial" w:cs="Arial"/>
+                <w:sz w:val="20"/>
+              </w:rPr>
+              <w:t xml:space="preserve"> </w:t>
+            </w:r>
+            <w:proofErr w:type="spellStart"/>
+            <w:r>
+              <w:rPr>
+                <w:rFonts w:ascii="Arial" w:hAnsi="Arial" w:cs="Arial"/>
+                <w:sz w:val="20"/>
+              </w:rPr>
+              <w:t>perintahnya</w:t>
+            </w:r>
+            <w:proofErr w:type="spellEnd"/>
+            <w:r>
+              <w:rPr>
+                <w:rFonts w:ascii="Arial" w:hAnsi="Arial" w:cs="Arial"/>
+                <w:sz w:val="20"/>
+              </w:rPr>
+              <w:t xml:space="preserve">, dan </w:t>
+            </w:r>
+            <w:proofErr w:type="spellStart"/>
+            <w:r>
+              <w:rPr>
+                <w:rFonts w:ascii="Arial" w:hAnsi="Arial" w:cs="Arial"/>
+                <w:sz w:val="20"/>
+              </w:rPr>
+              <w:t>semata</w:t>
+            </w:r>
+            <w:proofErr w:type="spellEnd"/>
+            <w:r>
+              <w:rPr>
+                <w:rFonts w:ascii="Arial" w:hAnsi="Arial" w:cs="Arial"/>
+                <w:sz w:val="20"/>
+              </w:rPr>
+              <w:t xml:space="preserve"> </w:t>
+            </w:r>
+            <w:proofErr w:type="spellStart"/>
+            <w:r>
+              <w:rPr>
+                <w:rFonts w:ascii="Arial" w:hAnsi="Arial" w:cs="Arial"/>
+                <w:sz w:val="20"/>
+              </w:rPr>
+              <w:t>mata</w:t>
+            </w:r>
+            <w:proofErr w:type="spellEnd"/>
+            <w:r>
+              <w:rPr>
+                <w:rFonts w:ascii="Arial" w:hAnsi="Arial" w:cs="Arial"/>
+                <w:sz w:val="20"/>
+              </w:rPr>
+              <w:t xml:space="preserve"> </w:t>
+            </w:r>
+            <w:proofErr w:type="spellStart"/>
+            <w:r>
+              <w:rPr>
+                <w:rFonts w:ascii="Arial" w:hAnsi="Arial" w:cs="Arial"/>
+                <w:sz w:val="20"/>
+              </w:rPr>
+              <w:t>untuk</w:t>
+            </w:r>
+            <w:proofErr w:type="spellEnd"/>
+            <w:r>
+              <w:rPr>
+                <w:rFonts w:ascii="Arial" w:hAnsi="Arial" w:cs="Arial"/>
+                <w:sz w:val="20"/>
+              </w:rPr>
+              <w:t xml:space="preserve"> </w:t>
+            </w:r>
+            <w:proofErr w:type="spellStart"/>
+            <w:r>
+              <w:rPr>
+                <w:rFonts w:ascii="Arial" w:hAnsi="Arial" w:cs="Arial"/>
+                <w:sz w:val="20"/>
+              </w:rPr>
+              <w:t>kepentingan</w:t>
+            </w:r>
+            <w:proofErr w:type="spellEnd"/>
+            <w:r>
+              <w:rPr>
+                <w:rFonts w:ascii="Arial" w:hAnsi="Arial" w:cs="Arial"/>
+                <w:sz w:val="20"/>
+              </w:rPr>
+              <w:t xml:space="preserve"> </w:t>
+            </w:r>
+            <w:proofErr w:type="spellStart"/>
+            <w:r>
+              <w:rPr>
+                <w:rFonts w:ascii="Arial" w:hAnsi="Arial" w:cs="Arial"/>
+                <w:sz w:val="20"/>
+              </w:rPr>
+              <w:t>jabatan</w:t>
+            </w:r>
+            <w:proofErr w:type="spellEnd"/>
+            <w:r>
+              <w:rPr>
+                <w:rFonts w:ascii="Arial" w:hAnsi="Arial" w:cs="Arial"/>
+                <w:sz w:val="20"/>
+              </w:rPr>
+              <w:t xml:space="preserve"> </w:t>
+            </w:r>
+            <w:proofErr w:type="spellStart"/>
+            <w:r>
+              <w:rPr>
+                <w:rFonts w:ascii="Arial" w:hAnsi="Arial" w:cs="Arial"/>
+                <w:sz w:val="20"/>
+              </w:rPr>
+              <w:t>dalam</w:t>
+            </w:r>
+            <w:proofErr w:type="spellEnd"/>
+            <w:r>
+              <w:rPr>
+                <w:rFonts w:ascii="Arial" w:hAnsi="Arial" w:cs="Arial"/>
+                <w:sz w:val="20"/>
+              </w:rPr>
+              <w:t xml:space="preserve"> </w:t>
+            </w:r>
+            <w:proofErr w:type="spellStart"/>
+            <w:r>
+              <w:rPr>
+                <w:rFonts w:ascii="Arial" w:hAnsi="Arial" w:cs="Arial"/>
+                <w:sz w:val="20"/>
+              </w:rPr>
+              <w:t>waktu</w:t>
+            </w:r>
+            <w:proofErr w:type="spellEnd"/>
+            <w:r>
+              <w:rPr>
+                <w:rFonts w:ascii="Arial" w:hAnsi="Arial" w:cs="Arial"/>
+                <w:sz w:val="20"/>
+              </w:rPr>
+              <w:t xml:space="preserve"> yang </w:t>
+            </w:r>
+            <w:proofErr w:type="spellStart"/>
+            <w:r>
+              <w:rPr>
+                <w:rFonts w:ascii="Arial" w:hAnsi="Arial" w:cs="Arial"/>
+                <w:sz w:val="20"/>
+              </w:rPr>
+              <w:t>sesingkat-singkatnya</w:t>
+            </w:r>
+            <w:proofErr w:type="spellEnd"/>
+            <w:r>
+              <w:rPr>
+                <w:rFonts w:ascii="Arial" w:hAnsi="Arial" w:cs="Arial"/>
+                <w:sz w:val="20"/>
+              </w:rPr>
+              <w:t>.</w:t>
             </w:r>
           </w:p>
         </w:tc>
@@ -8077,7 +8826,39 @@
                 <w:rFonts w:ascii="Arial" w:hAnsi="Arial" w:cs="Arial"/>
                 <w:sz w:val="20"/>
               </w:rPr>
-              <w:t>(Tempat kedudukan)</w:t>
+              <w:t>(</w:t>
+            </w:r>
+            <w:proofErr w:type="spellStart"/>
+            <w:r>
+              <w:rPr>
+                <w:rFonts w:ascii="Arial" w:hAnsi="Arial" w:cs="Arial"/>
+                <w:sz w:val="20"/>
+              </w:rPr>
+              <w:t>Tempat</w:t>
+            </w:r>
+            <w:proofErr w:type="spellEnd"/>
+            <w:r>
+              <w:rPr>
+                <w:rFonts w:ascii="Arial" w:hAnsi="Arial" w:cs="Arial"/>
+                <w:sz w:val="20"/>
+              </w:rPr>
+              <w:t xml:space="preserve"> </w:t>
+            </w:r>
+            <w:proofErr w:type="spellStart"/>
+            <w:r>
+              <w:rPr>
+                <w:rFonts w:ascii="Arial" w:hAnsi="Arial" w:cs="Arial"/>
+                <w:sz w:val="20"/>
+              </w:rPr>
+              <w:t>kedudukan</w:t>
+            </w:r>
+            <w:proofErr w:type="spellEnd"/>
+            <w:r>
+              <w:rPr>
+                <w:rFonts w:ascii="Arial" w:hAnsi="Arial" w:cs="Arial"/>
+                <w:sz w:val="20"/>
+              </w:rPr>
+              <w:t>)</w:t>
             </w:r>
           </w:p>
         </w:tc>
@@ -8158,8 +8939,17 @@
                 <w:rFonts w:ascii="Arial" w:hAnsi="Arial" w:cs="Arial"/>
                 <w:sz w:val="20"/>
               </w:rPr>
-              <w:t>Pada tanggal</w:t>
-            </w:r>
+              <w:t xml:space="preserve">Pada </w:t>
+            </w:r>
+            <w:proofErr w:type="spellStart"/>
+            <w:r>
+              <w:rPr>
+                <w:rFonts w:ascii="Arial" w:hAnsi="Arial" w:cs="Arial"/>
+                <w:sz w:val="20"/>
+              </w:rPr>
+              <w:t>tanggal</w:t>
+            </w:r>
+            <w:proofErr w:type="spellEnd"/>
           </w:p>
         </w:tc>
         <w:tc>
@@ -8744,12 +9534,21 @@
                 <w:sz w:val="20"/>
               </w:rPr>
             </w:pPr>
-            <w:r>
-              <w:rPr>
-                <w:rFonts w:ascii="Arial" w:hAnsi="Arial" w:cs="Arial"/>
-                <w:sz w:val="20"/>
-              </w:rPr>
-              <w:t>Catatan lain-lain</w:t>
+            <w:proofErr w:type="spellStart"/>
+            <w:r>
+              <w:rPr>
+                <w:rFonts w:ascii="Arial" w:hAnsi="Arial" w:cs="Arial"/>
+                <w:sz w:val="20"/>
+              </w:rPr>
+              <w:t>Catatan</w:t>
+            </w:r>
+            <w:proofErr w:type="spellEnd"/>
+            <w:r>
+              <w:rPr>
+                <w:rFonts w:ascii="Arial" w:hAnsi="Arial" w:cs="Arial"/>
+                <w:sz w:val="20"/>
+              </w:rPr>
+              <w:t xml:space="preserve"> lain-lain</w:t>
             </w:r>
           </w:p>
         </w:tc>
@@ -8877,7 +9676,71 @@
                 <w:rFonts w:ascii="Arial" w:hAnsi="Arial" w:cs="Arial"/>
                 <w:sz w:val="20"/>
               </w:rPr>
-              <w:t xml:space="preserve"> yang menerbitkan SPD, pegawai yang melakukan perjalanan </w:t>
+              <w:t xml:space="preserve"> yang </w:t>
+            </w:r>
+            <w:proofErr w:type="spellStart"/>
+            <w:r>
+              <w:rPr>
+                <w:rFonts w:ascii="Arial" w:hAnsi="Arial" w:cs="Arial"/>
+                <w:sz w:val="20"/>
+              </w:rPr>
+              <w:t>menerbitkan</w:t>
+            </w:r>
+            <w:proofErr w:type="spellEnd"/>
+            <w:r>
+              <w:rPr>
+                <w:rFonts w:ascii="Arial" w:hAnsi="Arial" w:cs="Arial"/>
+                <w:sz w:val="20"/>
+              </w:rPr>
+              <w:t xml:space="preserve"> SPD, </w:t>
+            </w:r>
+            <w:proofErr w:type="spellStart"/>
+            <w:r>
+              <w:rPr>
+                <w:rFonts w:ascii="Arial" w:hAnsi="Arial" w:cs="Arial"/>
+                <w:sz w:val="20"/>
+              </w:rPr>
+              <w:t>pegawai</w:t>
+            </w:r>
+            <w:proofErr w:type="spellEnd"/>
+            <w:r>
+              <w:rPr>
+                <w:rFonts w:ascii="Arial" w:hAnsi="Arial" w:cs="Arial"/>
+                <w:sz w:val="20"/>
+              </w:rPr>
+              <w:t xml:space="preserve"> yang </w:t>
+            </w:r>
+            <w:proofErr w:type="spellStart"/>
+            <w:r>
+              <w:rPr>
+                <w:rFonts w:ascii="Arial" w:hAnsi="Arial" w:cs="Arial"/>
+                <w:sz w:val="20"/>
+              </w:rPr>
+              <w:t>melakukan</w:t>
+            </w:r>
+            <w:proofErr w:type="spellEnd"/>
+            <w:r>
+              <w:rPr>
+                <w:rFonts w:ascii="Arial" w:hAnsi="Arial" w:cs="Arial"/>
+                <w:sz w:val="20"/>
+              </w:rPr>
+              <w:t xml:space="preserve"> </w:t>
+            </w:r>
+            <w:proofErr w:type="spellStart"/>
+            <w:r>
+              <w:rPr>
+                <w:rFonts w:ascii="Arial" w:hAnsi="Arial" w:cs="Arial"/>
+                <w:sz w:val="20"/>
+              </w:rPr>
+              <w:t>perjalanan</w:t>
+            </w:r>
+            <w:proofErr w:type="spellEnd"/>
+            <w:r>
+              <w:rPr>
+                <w:rFonts w:ascii="Arial" w:hAnsi="Arial" w:cs="Arial"/>
+                <w:sz w:val="20"/>
+              </w:rPr>
+              <w:t xml:space="preserve"> </w:t>
             </w:r>
             <w:r>
               <w:rPr>
@@ -8887,6 +9750,7 @@
               </w:rPr>
               <w:t>d</w:t>
             </w:r>
+            <w:proofErr w:type="spellStart"/>
             <w:r>
               <w:rPr>
                 <w:rFonts w:ascii="Arial" w:hAnsi="Arial" w:cs="Arial"/>
@@ -8894,6 +9758,7 @@
               </w:rPr>
               <w:t>inas</w:t>
             </w:r>
+            <w:proofErr w:type="spellEnd"/>
             <w:r>
               <w:rPr>
                 <w:rFonts w:ascii="Arial" w:hAnsi="Arial" w:cs="Arial"/>
@@ -8907,8 +9772,113 @@
                 <w:rFonts w:ascii="Arial" w:hAnsi="Arial" w:cs="Arial"/>
                 <w:sz w:val="20"/>
               </w:rPr>
-              <w:t xml:space="preserve"> para pejabat yang mengesahkan tanggal berangkat/tiba serta bendahara</w:t>
-            </w:r>
+              <w:t xml:space="preserve"> para </w:t>
+            </w:r>
+            <w:proofErr w:type="spellStart"/>
+            <w:r>
+              <w:rPr>
+                <w:rFonts w:ascii="Arial" w:hAnsi="Arial" w:cs="Arial"/>
+                <w:sz w:val="20"/>
+              </w:rPr>
+              <w:t>pejabat</w:t>
+            </w:r>
+            <w:proofErr w:type="spellEnd"/>
+            <w:r>
+              <w:rPr>
+                <w:rFonts w:ascii="Arial" w:hAnsi="Arial" w:cs="Arial"/>
+                <w:sz w:val="20"/>
+              </w:rPr>
+              <w:t xml:space="preserve"> yang </w:t>
+            </w:r>
+            <w:proofErr w:type="spellStart"/>
+            <w:r>
+              <w:rPr>
+                <w:rFonts w:ascii="Arial" w:hAnsi="Arial" w:cs="Arial"/>
+                <w:sz w:val="20"/>
+              </w:rPr>
+              <w:t>mengesahkan</w:t>
+            </w:r>
+            <w:proofErr w:type="spellEnd"/>
+            <w:r>
+              <w:rPr>
+                <w:rFonts w:ascii="Arial" w:hAnsi="Arial" w:cs="Arial"/>
+                <w:sz w:val="20"/>
+              </w:rPr>
+              <w:t xml:space="preserve"> </w:t>
+            </w:r>
+            <w:proofErr w:type="spellStart"/>
+            <w:r>
+              <w:rPr>
+                <w:rFonts w:ascii="Arial" w:hAnsi="Arial" w:cs="Arial"/>
+                <w:sz w:val="20"/>
+              </w:rPr>
+              <w:t>tanggal</w:t>
+            </w:r>
+            <w:proofErr w:type="spellEnd"/>
+            <w:r>
+              <w:rPr>
+                <w:rFonts w:ascii="Arial" w:hAnsi="Arial" w:cs="Arial"/>
+                <w:sz w:val="20"/>
+              </w:rPr>
+              <w:t xml:space="preserve"> </w:t>
+            </w:r>
+            <w:proofErr w:type="spellStart"/>
+            <w:r>
+              <w:rPr>
+                <w:rFonts w:ascii="Arial" w:hAnsi="Arial" w:cs="Arial"/>
+                <w:sz w:val="20"/>
+              </w:rPr>
+              <w:t>berangkat</w:t>
+            </w:r>
+            <w:proofErr w:type="spellEnd"/>
+            <w:r>
+              <w:rPr>
+                <w:rFonts w:ascii="Arial" w:hAnsi="Arial" w:cs="Arial"/>
+                <w:sz w:val="20"/>
+              </w:rPr>
+              <w:t>/</w:t>
+            </w:r>
+            <w:proofErr w:type="spellStart"/>
+            <w:r>
+              <w:rPr>
+                <w:rFonts w:ascii="Arial" w:hAnsi="Arial" w:cs="Arial"/>
+                <w:sz w:val="20"/>
+              </w:rPr>
+              <w:t>tiba</w:t>
+            </w:r>
+            <w:proofErr w:type="spellEnd"/>
+            <w:r>
+              <w:rPr>
+                <w:rFonts w:ascii="Arial" w:hAnsi="Arial" w:cs="Arial"/>
+                <w:sz w:val="20"/>
+              </w:rPr>
+              <w:t xml:space="preserve"> </w:t>
+            </w:r>
+            <w:proofErr w:type="spellStart"/>
+            <w:r>
+              <w:rPr>
+                <w:rFonts w:ascii="Arial" w:hAnsi="Arial" w:cs="Arial"/>
+                <w:sz w:val="20"/>
+              </w:rPr>
+              <w:t>serta</w:t>
+            </w:r>
+            <w:proofErr w:type="spellEnd"/>
+            <w:r>
+              <w:rPr>
+                <w:rFonts w:ascii="Arial" w:hAnsi="Arial" w:cs="Arial"/>
+                <w:sz w:val="20"/>
+              </w:rPr>
+              <w:t xml:space="preserve"> </w:t>
+            </w:r>
+            <w:proofErr w:type="spellStart"/>
+            <w:r>
+              <w:rPr>
+                <w:rFonts w:ascii="Arial" w:hAnsi="Arial" w:cs="Arial"/>
+                <w:sz w:val="20"/>
+              </w:rPr>
+              <w:t>bendahara</w:t>
+            </w:r>
+            <w:proofErr w:type="spellEnd"/>
             <w:r>
               <w:rPr>
                 <w:rFonts w:ascii="Arial" w:hAnsi="Arial" w:cs="Arial"/>
@@ -8917,12 +9887,69 @@
               </w:rPr>
               <w:t xml:space="preserve"> pengeluaran </w:t>
             </w:r>
-            <w:r>
-              <w:rPr>
-                <w:rFonts w:ascii="Arial" w:hAnsi="Arial" w:cs="Arial"/>
-                <w:sz w:val="20"/>
-              </w:rPr>
-              <w:t xml:space="preserve">bertanggung jawab berdasarkan peraturan-peraturan </w:t>
+            <w:proofErr w:type="spellStart"/>
+            <w:r>
+              <w:rPr>
+                <w:rFonts w:ascii="Arial" w:hAnsi="Arial" w:cs="Arial"/>
+                <w:sz w:val="20"/>
+              </w:rPr>
+              <w:t>bertanggung</w:t>
+            </w:r>
+            <w:proofErr w:type="spellEnd"/>
+            <w:r>
+              <w:rPr>
+                <w:rFonts w:ascii="Arial" w:hAnsi="Arial" w:cs="Arial"/>
+                <w:sz w:val="20"/>
+              </w:rPr>
+              <w:t xml:space="preserve"> </w:t>
+            </w:r>
+            <w:proofErr w:type="spellStart"/>
+            <w:r>
+              <w:rPr>
+                <w:rFonts w:ascii="Arial" w:hAnsi="Arial" w:cs="Arial"/>
+                <w:sz w:val="20"/>
+              </w:rPr>
+              <w:t>jawab</w:t>
+            </w:r>
+            <w:proofErr w:type="spellEnd"/>
+            <w:r>
+              <w:rPr>
+                <w:rFonts w:ascii="Arial" w:hAnsi="Arial" w:cs="Arial"/>
+                <w:sz w:val="20"/>
+              </w:rPr>
+              <w:t xml:space="preserve"> </w:t>
+            </w:r>
+            <w:proofErr w:type="spellStart"/>
+            <w:r>
+              <w:rPr>
+                <w:rFonts w:ascii="Arial" w:hAnsi="Arial" w:cs="Arial"/>
+                <w:sz w:val="20"/>
+              </w:rPr>
+              <w:t>berdasarkan</w:t>
+            </w:r>
+            <w:proofErr w:type="spellEnd"/>
+            <w:r>
+              <w:rPr>
+                <w:rFonts w:ascii="Arial" w:hAnsi="Arial" w:cs="Arial"/>
+                <w:sz w:val="20"/>
+              </w:rPr>
+              <w:t xml:space="preserve"> </w:t>
+            </w:r>
+            <w:proofErr w:type="spellStart"/>
+            <w:r>
+              <w:rPr>
+                <w:rFonts w:ascii="Arial" w:hAnsi="Arial" w:cs="Arial"/>
+                <w:sz w:val="20"/>
+              </w:rPr>
+              <w:t>peraturan-peraturan</w:t>
+            </w:r>
+            <w:proofErr w:type="spellEnd"/>
+            <w:r>
+              <w:rPr>
+                <w:rFonts w:ascii="Arial" w:hAnsi="Arial" w:cs="Arial"/>
+                <w:sz w:val="20"/>
+              </w:rPr>
+              <w:t xml:space="preserve"> </w:t>
             </w:r>
             <w:r>
               <w:rPr>
@@ -8932,12 +9959,21 @@
               </w:rPr>
               <w:t>K</w:t>
             </w:r>
-            <w:r>
-              <w:rPr>
-                <w:rFonts w:ascii="Arial" w:hAnsi="Arial" w:cs="Arial"/>
-                <w:sz w:val="20"/>
-              </w:rPr>
-              <w:t xml:space="preserve">euangan </w:t>
+            <w:proofErr w:type="spellStart"/>
+            <w:r>
+              <w:rPr>
+                <w:rFonts w:ascii="Arial" w:hAnsi="Arial" w:cs="Arial"/>
+                <w:sz w:val="20"/>
+              </w:rPr>
+              <w:t>euangan</w:t>
+            </w:r>
+            <w:proofErr w:type="spellEnd"/>
+            <w:r>
+              <w:rPr>
+                <w:rFonts w:ascii="Arial" w:hAnsi="Arial" w:cs="Arial"/>
+                <w:sz w:val="20"/>
+              </w:rPr>
+              <w:t xml:space="preserve"> </w:t>
             </w:r>
             <w:r>
               <w:rPr>
@@ -8947,12 +9983,37 @@
               </w:rPr>
               <w:t>N</w:t>
             </w:r>
-            <w:r>
-              <w:rPr>
-                <w:rFonts w:ascii="Arial" w:hAnsi="Arial" w:cs="Arial"/>
-                <w:sz w:val="20"/>
-              </w:rPr>
-              <w:t xml:space="preserve">egara, apabila </w:t>
+            <w:proofErr w:type="spellStart"/>
+            <w:r>
+              <w:rPr>
+                <w:rFonts w:ascii="Arial" w:hAnsi="Arial" w:cs="Arial"/>
+                <w:sz w:val="20"/>
+              </w:rPr>
+              <w:t>egara</w:t>
+            </w:r>
+            <w:proofErr w:type="spellEnd"/>
+            <w:r>
+              <w:rPr>
+                <w:rFonts w:ascii="Arial" w:hAnsi="Arial" w:cs="Arial"/>
+                <w:sz w:val="20"/>
+              </w:rPr>
+              <w:t xml:space="preserve">, </w:t>
+            </w:r>
+            <w:proofErr w:type="spellStart"/>
+            <w:r>
+              <w:rPr>
+                <w:rFonts w:ascii="Arial" w:hAnsi="Arial" w:cs="Arial"/>
+                <w:sz w:val="20"/>
+              </w:rPr>
+              <w:t>apabila</w:t>
+            </w:r>
+            <w:proofErr w:type="spellEnd"/>
+            <w:r>
+              <w:rPr>
+                <w:rFonts w:ascii="Arial" w:hAnsi="Arial" w:cs="Arial"/>
+                <w:sz w:val="20"/>
+              </w:rPr>
+              <w:t xml:space="preserve"> </w:t>
             </w:r>
             <w:r>
               <w:rPr>
@@ -8962,13 +10023,79 @@
               </w:rPr>
               <w:t>n</w:t>
             </w:r>
-            <w:r>
-              <w:rPr>
-                <w:rFonts w:ascii="Arial" w:hAnsi="Arial" w:cs="Arial"/>
-                <w:sz w:val="20"/>
-              </w:rPr>
-              <w:t>egara menderita rugi akibat kesalahan</w:t>
-            </w:r>
+            <w:proofErr w:type="spellStart"/>
+            <w:r>
+              <w:rPr>
+                <w:rFonts w:ascii="Arial" w:hAnsi="Arial" w:cs="Arial"/>
+                <w:sz w:val="20"/>
+              </w:rPr>
+              <w:t>egara</w:t>
+            </w:r>
+            <w:proofErr w:type="spellEnd"/>
+            <w:r>
+              <w:rPr>
+                <w:rFonts w:ascii="Arial" w:hAnsi="Arial" w:cs="Arial"/>
+                <w:sz w:val="20"/>
+              </w:rPr>
+              <w:t xml:space="preserve"> </w:t>
+            </w:r>
+            <w:proofErr w:type="spellStart"/>
+            <w:r>
+              <w:rPr>
+                <w:rFonts w:ascii="Arial" w:hAnsi="Arial" w:cs="Arial"/>
+                <w:sz w:val="20"/>
+              </w:rPr>
+              <w:t>menderita</w:t>
+            </w:r>
+            <w:proofErr w:type="spellEnd"/>
+            <w:r>
+              <w:rPr>
+                <w:rFonts w:ascii="Arial" w:hAnsi="Arial" w:cs="Arial"/>
+                <w:sz w:val="20"/>
+              </w:rPr>
+              <w:t xml:space="preserve"> </w:t>
+            </w:r>
+            <w:proofErr w:type="spellStart"/>
+            <w:r>
+              <w:rPr>
+                <w:rFonts w:ascii="Arial" w:hAnsi="Arial" w:cs="Arial"/>
+                <w:sz w:val="20"/>
+              </w:rPr>
+              <w:t>rugi</w:t>
+            </w:r>
+            <w:proofErr w:type="spellEnd"/>
+            <w:r>
+              <w:rPr>
+                <w:rFonts w:ascii="Arial" w:hAnsi="Arial" w:cs="Arial"/>
+                <w:sz w:val="20"/>
+              </w:rPr>
+              <w:t xml:space="preserve"> </w:t>
+            </w:r>
+            <w:proofErr w:type="spellStart"/>
+            <w:r>
+              <w:rPr>
+                <w:rFonts w:ascii="Arial" w:hAnsi="Arial" w:cs="Arial"/>
+                <w:sz w:val="20"/>
+              </w:rPr>
+              <w:t>akibat</w:t>
+            </w:r>
+            <w:proofErr w:type="spellEnd"/>
+            <w:r>
+              <w:rPr>
+                <w:rFonts w:ascii="Arial" w:hAnsi="Arial" w:cs="Arial"/>
+                <w:sz w:val="20"/>
+              </w:rPr>
+              <w:t xml:space="preserve"> </w:t>
+            </w:r>
+            <w:proofErr w:type="spellStart"/>
+            <w:r>
+              <w:rPr>
+                <w:rFonts w:ascii="Arial" w:hAnsi="Arial" w:cs="Arial"/>
+                <w:sz w:val="20"/>
+              </w:rPr>
+              <w:t>kesalahan</w:t>
+            </w:r>
+            <w:proofErr w:type="spellEnd"/>
             <w:r>
               <w:rPr>
                 <w:rFonts w:ascii="Arial" w:hAnsi="Arial" w:cs="Arial"/>
@@ -8982,8 +10109,17 @@
                 <w:rFonts w:ascii="Arial" w:hAnsi="Arial" w:cs="Arial"/>
                 <w:sz w:val="20"/>
               </w:rPr>
-              <w:t xml:space="preserve"> dan keal</w:t>
-            </w:r>
+              <w:t xml:space="preserve"> dan </w:t>
+            </w:r>
+            <w:proofErr w:type="spellStart"/>
+            <w:r>
+              <w:rPr>
+                <w:rFonts w:ascii="Arial" w:hAnsi="Arial" w:cs="Arial"/>
+                <w:sz w:val="20"/>
+              </w:rPr>
+              <w:t>keal</w:t>
+            </w:r>
+            <w:proofErr w:type="spellEnd"/>
             <w:r>
               <w:rPr>
                 <w:rFonts w:ascii="Arial" w:hAnsi="Arial" w:cs="Arial"/>
@@ -8992,12 +10128,21 @@
               </w:rPr>
               <w:t>p</w:t>
             </w:r>
-            <w:r>
-              <w:rPr>
-                <w:rFonts w:ascii="Arial" w:hAnsi="Arial" w:cs="Arial"/>
-                <w:sz w:val="20"/>
-              </w:rPr>
-              <w:t>aannya.</w:t>
+            <w:proofErr w:type="spellStart"/>
+            <w:r>
+              <w:rPr>
+                <w:rFonts w:ascii="Arial" w:hAnsi="Arial" w:cs="Arial"/>
+                <w:sz w:val="20"/>
+              </w:rPr>
+              <w:t>aannya</w:t>
+            </w:r>
+            <w:proofErr w:type="spellEnd"/>
+            <w:r>
+              <w:rPr>
+                <w:rFonts w:ascii="Arial" w:hAnsi="Arial" w:cs="Arial"/>
+                <w:sz w:val="20"/>
+              </w:rPr>
+              <w:t>.</w:t>
             </w:r>
           </w:p>
         </w:tc>

</xml_diff>

<commit_message>
statis spd dan kuitansi
</commit_message>
<xml_diff>
--- a/public/spd-format.docx
+++ b/public/spd-format.docx
@@ -688,36 +688,9 @@
                 <w:rFonts w:ascii="Arial" w:hAnsi="Arial" w:cs="Arial"/>
                 <w:sz w:val="20"/>
                 <w:szCs w:val="20"/>
-                <w:lang w:val="sv-SE"/>
-              </w:rPr>
-              <w:t xml:space="preserve">Unit </w:t>
-            </w:r>
-            <w:r>
-              <w:rPr>
-                <w:rFonts w:ascii="Arial" w:hAnsi="Arial" w:cs="Arial"/>
-                <w:sz w:val="20"/>
-                <w:szCs w:val="20"/>
                 <w:lang w:val="id-ID"/>
               </w:rPr>
-              <w:t>{</w:t>
-            </w:r>
-            <w:r>
-              <w:rPr>
-                <w:rFonts w:ascii="Arial" w:hAnsi="Arial" w:cs="Arial"/>
-                <w:sz w:val="20"/>
-                <w:szCs w:val="20"/>
-                <w:lang w:val="id-ID"/>
-              </w:rPr>
-              <w:t>namaKantorCapitalize</w:t>
-            </w:r>
-            <w:r>
-              <w:rPr>
-                <w:rFonts w:ascii="Arial" w:hAnsi="Arial" w:cs="Arial"/>
-                <w:sz w:val="20"/>
-                <w:szCs w:val="20"/>
-                <w:lang w:val="id-ID"/>
-              </w:rPr>
-              <w:t>}</w:t>
+              <w:t>Unit Organisasi Kantor Wilayah Kementerian Haji dan Umrah Provinsi Jawa Barat</w:t>
             </w:r>
           </w:p>
         </w:tc>
@@ -13258,6 +13231,9 @@
   <wne:recipientData>
     <wne:active wne:val="1"/>
   </wne:recipientData>
+  <wne:recipientData>
+    <wne:active wne:val="1"/>
+  </wne:recipientData>
 </wne:recipients>
 </file>
 

</xml_diff>